<commit_message>
feat: implement ops-support job management module with UI components and cron scheduling support
</commit_message>
<xml_diff>
--- a/frontend/config/cic-reference.example.docx
+++ b/frontend/config/cic-reference.example.docx
@@ -440,7 +440,7 @@
         <w:bottom w:val="single" w:color="2E75B6" w:sz="4" w:space="4"/>
       </w:pBdr>
       <w:tabs>
-        <w:tab w:val="right" w:pos="9026"/>
+        <w:tab w:val="right" w:pos="9355"/>
       </w:tabs>
       <w:spacing w:after="120" w:before="0"/>
     </w:pPr>
@@ -455,7 +455,7 @@
         <w:sz w:val="18"/>
         <w:szCs w:val="18"/>
       </w:rPr>
-      <w:t xml:space="preserve">TRUNG TÂM THÔNG TIN TÍN DỤNG QUỐC GIA VIỆT NAM (CIC)</w:t>
+      <w:t xml:space="preserve">TÀI LIỆU ĐẶC TẢ CHỨC NĂNG</w:t>
     </w:r>
     <w:r>
       <w:rPr>
@@ -474,7 +474,7 @@
         <w:sz w:val="18"/>
         <w:szCs w:val="18"/>
       </w:rPr>
-      <w:t xml:space="preserve">Tài liệu Thiết kế Giao diện</w:t>
+      <w:t xml:space="preserve">Phiên bản:.....</w:t>
     </w:r>
   </w:p>
 </w:hdr>
@@ -598,13 +598,14 @@
       <w:rPr>
         <w:rFonts w:ascii="Times New Roman" w:eastAsia="Times New Roman" w:hAnsi="Times New Roman" w:cs="Times New Roman"/>
         <w:color w:val="1A1A1A"/>
-        <w:sz w:val="22"/>
-        <w:szCs w:val="22"/>
+        <w:sz w:val="26"/>
+        <w:szCs w:val="26"/>
         <w:lang w:val="vi-VN" w:eastAsia="vi-VN" w:bidi="ar-SA"/>
       </w:rPr>
     </w:rPrDefault>
     <w:pPrDefault>
       <w:pPr>
+        <w:jc w:val="both"/>
         <w:spacing w:before="120" w:after="120" w:line="240" w:lineRule="auto"/>
       </w:pPr>
     </w:pPrDefault>
@@ -789,8 +790,8 @@
       <w:b/>
       <w:bCs/>
       <w:color w:val="2E74B5"/>
-      <w:sz w:val="32"/>
-      <w:szCs w:val="32"/>
+      <w:sz w:val="28"/>
+      <w:szCs w:val="28"/>
     </w:rPr>
   </w:style>
   <w:style w:type="paragraph" w:styleId="Heading2">

</xml_diff>